<commit_message>
Commit with added services
</commit_message>
<xml_diff>
--- a/Rapport_Projet_Final_FortisBankSystems.docx
+++ b/Rapport_Projet_Final_FortisBankSystems.docx
@@ -674,7 +674,7 @@
         <w:spacing w:after="40"/>
       </w:pPr>
       <w:r>
-        <w:t>banksystem.service      — CustomerService, ManagerService, LoginService</w:t>
+        <w:t>banksystem.service      — CustomerService, ManagerService, LoginService, AccountService, TransactionService, SavingsAccountService, CheckingAccountService, CreditAccountService, CurrencyAccountService, LineOfCreditAccountService</w:t>
       </w:r>
     </w:p>
     <w:p>
@@ -683,7 +683,7 @@
         <w:spacing w:after="40"/>
       </w:pPr>
       <w:r>
-        <w:t>banksystem.ui.client1   — BankManager (Q3)</w:t>
+        <w:t>banksystem.ui.client1   — BankManager, ManagerTabPanel, CustomerTabPanel, AccountTabPanel, LogTabPanel</w:t>
       </w:r>
     </w:p>
     <w:p>
@@ -692,7 +692,7 @@
         <w:spacing w:after="40"/>
       </w:pPr>
       <w:r>
-        <w:t>banksystem.ui.client2   — BankCustomer (Q4)</w:t>
+        <w:t>banksystem.ui.client2   — BankCustomer, TransactionTabPanel, MovementsTabPanel, HistoryTabPanel</w:t>
       </w:r>
     </w:p>
     <w:p>
@@ -714,7 +714,7 @@
         <w:pStyle w:val="ListBullet"/>
       </w:pPr>
       <w:r>
-        <w:t>banksystem.util         — BankLogger, PasswordUtil, SessionManager, PdfExporter, CsvExporter</w:t>
+        <w:t>banksystem.util         — BankLogger, PasswordUtil, SessionManager, PdfExporter, CsvExporter, UiUtils</w:t>
       </w:r>
     </w:p>
     <w:p>
@@ -1424,7 +1424,7 @@
         <w:t xml:space="preserve">Objet de transfert pour la table BankAccount. </w:t>
       </w:r>
       <w:r>
-        <w:t xml:space="preserve">Champs : accountId (long), customerId (int), accountType (String : SAVINGS/CHECKING/CREDIT/CURRENCY), balance (double), status (String : ACTIVE/FROZEN/CLOSED), dailyLimit (double), openedDate (Date). </w:t>
+        <w:t xml:space="preserve">Champs : accountId (long), customerId (int), accountType (String : SAVINGS/CHECKING/CREDIT/LINE_OF_CREDIT/CURRENCY), balance (double), status (String : ACTIVE/FROZEN/CLOSED), dailyLimit (double), openedDate (Date). </w:t>
       </w:r>
       <w:r>
         <w:rPr>
@@ -1858,6 +1858,17 @@
     </w:p>
     <w:p>
       <w:pPr>
+        <w:pStyle w:val="Normal"/>
+        <w:rPr>
+          <w:lang w:val="fr-FR"/>
+        </w:rPr>
+      </w:pPr>
+      <w:r>
+        <w:t>La couche SERVICE contient 10 classes : CustomerService, ManagerService, LoginService, AccountService, TransactionService, SavingsAccountService, CheckingAccountService, CreditAccountService, CurrencyAccountService et LineOfCreditAccountService. Chaque classe valide les entrées, délègue au DAO correspondant, journalise via BankLogger et — pour les services de compte — enregistre automatiquement une transaction dans la base.</w:t>
+      </w:r>
+    </w:p>
+    <w:p>
+      <w:pPr>
         <w:pStyle w:val="Heading3"/>
         <w:rPr>
           <w:lang w:val="fr-FR"/>
@@ -2067,6 +2078,479 @@
     </w:p>
     <w:p>
       <w:pPr>
+        <w:pStyle w:val="Heading3"/>
+        <w:rPr>
+          <w:lang w:val="fr-FR"/>
+        </w:rPr>
+      </w:pPr>
+      <w:r>
+        <w:t>AccountService</w:t>
+      </w:r>
+    </w:p>
+    <w:p>
+      <w:pPr>
+        <w:pStyle w:val="Normal"/>
+        <w:rPr>
+          <w:lang w:val="fr-FR"/>
+        </w:rPr>
+      </w:pPr>
+      <w:r>
+        <w:t>Couche service générale pour la gestion des comptes bancaires. Délègue les opérations à AccountDAO et enregistre les virements via TransactionDAO.</w:t>
+      </w:r>
+    </w:p>
+    <w:p>
+      <w:pPr>
+        <w:pStyle w:val="ListBullet"/>
+        <w:rPr>
+          <w:lang w:val="fr-FR"/>
+        </w:rPr>
+      </w:pPr>
+      <w:r>
+        <w:t>getAllAccounts() : retourne tous les comptes de la base via AccountDAO.selectAll().</w:t>
+      </w:r>
+    </w:p>
+    <w:p>
+      <w:pPr>
+        <w:pStyle w:val="ListBullet"/>
+        <w:rPr>
+          <w:lang w:val="fr-FR"/>
+        </w:rPr>
+      </w:pPr>
+      <w:r>
+        <w:t>getAccountById(accountId) : retourne un AccountDTO ou null si introuvable.</w:t>
+      </w:r>
+    </w:p>
+    <w:p>
+      <w:pPr>
+        <w:pStyle w:val="ListBullet"/>
+        <w:rPr>
+          <w:lang w:val="fr-FR"/>
+        </w:rPr>
+      </w:pPr>
+      <w:r>
+        <w:t>getAccountsByCustomer(customerId) : retourne la liste des comptes d'un client.</w:t>
+      </w:r>
+    </w:p>
+    <w:p>
+      <w:pPr>
+        <w:pStyle w:val="ListBullet"/>
+        <w:rPr>
+          <w:lang w:val="fr-FR"/>
+        </w:rPr>
+      </w:pPr>
+      <w:r>
+        <w:t>updateStatus(accountId, status) : met à jour le statut ACTIVE/FROZEN/CLOSED dans Oracle.</w:t>
+      </w:r>
+    </w:p>
+    <w:p>
+      <w:pPr>
+        <w:pStyle w:val="ListBullet"/>
+        <w:rPr>
+          <w:lang w:val="fr-FR"/>
+        </w:rPr>
+      </w:pPr>
+      <w:r>
+        <w:t>deleteAccount(accountId) : supprime un compte bancaire après validation.</w:t>
+      </w:r>
+    </w:p>
+    <w:p>
+      <w:pPr>
+        <w:pStyle w:val="ListBullet"/>
+        <w:rPr>
+          <w:lang w:val="fr-FR"/>
+        </w:rPr>
+      </w:pPr>
+      <w:r>
+        <w:t>transfer(fromId, toId, customerId, amount, description) : virement — débite le compte source et crédite le compte destination. Enregistre deux transactions (WITHDRAWAL + DEPOSIT).</w:t>
+      </w:r>
+    </w:p>
+    <w:p>
+      <w:pPr>
+        <w:pStyle w:val="Heading3"/>
+        <w:rPr>
+          <w:lang w:val="fr-FR"/>
+        </w:rPr>
+      </w:pPr>
+      <w:r>
+        <w:t>TransactionService</w:t>
+      </w:r>
+    </w:p>
+    <w:p>
+      <w:pPr>
+        <w:pStyle w:val="Normal"/>
+        <w:rPr>
+          <w:lang w:val="fr-FR"/>
+        </w:rPr>
+      </w:pPr>
+      <w:r>
+        <w:t>Couche de service pour l'enregistrement et la consultation des transactions. Fait le pont entre l'UI et TransactionDAO en ajoutant la validation des entrées et la journalisation.</w:t>
+      </w:r>
+    </w:p>
+    <w:p>
+      <w:pPr>
+        <w:pStyle w:val="ListBullet"/>
+        <w:rPr>
+          <w:lang w:val="fr-FR"/>
+        </w:rPr>
+      </w:pPr>
+      <w:r>
+        <w:t>recordTransaction(dto) : valide et insère une TransactionDTO via TransactionDAO. Retourne le nouvel ID de transaction ou -1 en cas d'échec.</w:t>
+      </w:r>
+    </w:p>
+    <w:p>
+      <w:pPr>
+        <w:pStyle w:val="ListBullet"/>
+        <w:rPr>
+          <w:lang w:val="fr-FR"/>
+        </w:rPr>
+      </w:pPr>
+      <w:r>
+        <w:t>getRecentTransactions(accountId) / getRecentTransactions(accountId, limit) : retourne les N dernières transactions d'un compte.</w:t>
+      </w:r>
+    </w:p>
+    <w:p>
+      <w:pPr>
+        <w:pStyle w:val="ListBullet"/>
+        <w:rPr>
+          <w:lang w:val="fr-FR"/>
+        </w:rPr>
+      </w:pPr>
+      <w:r>
+        <w:t>getAllByCustomer(customerId) : retourne toutes les transactions de tous les comptes d'un client.</w:t>
+      </w:r>
+    </w:p>
+    <w:p>
+      <w:pPr>
+        <w:pStyle w:val="ListBullet"/>
+        <w:rPr>
+          <w:lang w:val="fr-FR"/>
+        </w:rPr>
+      </w:pPr>
+      <w:r>
+        <w:t>getAllByAccount(accountId) : retourne toutes les transactions d'un compte spécifique.</w:t>
+      </w:r>
+    </w:p>
+    <w:p>
+      <w:pPr>
+        <w:pStyle w:val="Heading3"/>
+        <w:rPr>
+          <w:lang w:val="fr-FR"/>
+        </w:rPr>
+      </w:pPr>
+      <w:r>
+        <w:t>SavingsAccountService</w:t>
+      </w:r>
+    </w:p>
+    <w:p>
+      <w:pPr>
+        <w:pStyle w:val="Normal"/>
+        <w:rPr>
+          <w:lang w:val="fr-FR"/>
+        </w:rPr>
+      </w:pPr>
+      <w:r>
+        <w:t>Gère les dépôts, retraits et intérêts mensuels sur les comptes d'épargne (SAVINGS). Chaque opération enregistre automatiquement une transaction dans la base via TransactionDAO.</w:t>
+      </w:r>
+    </w:p>
+    <w:p>
+      <w:pPr>
+        <w:pStyle w:val="ListBullet"/>
+        <w:rPr>
+          <w:lang w:val="fr-FR"/>
+        </w:rPr>
+      </w:pPr>
+      <w:r>
+        <w:t>deposit(accountId, customerId, amount, description) : augmente le solde. Vérifie statut ACTIVE.</w:t>
+      </w:r>
+    </w:p>
+    <w:p>
+      <w:pPr>
+        <w:pStyle w:val="ListBullet"/>
+        <w:rPr>
+          <w:lang w:val="fr-FR"/>
+        </w:rPr>
+      </w:pPr>
+      <w:r>
+        <w:t>withdraw(accountId, customerId, amount, description) : réduit le solde. Vérifie statut ACTIVE, solde suffisant et limite journalière.</w:t>
+      </w:r>
+    </w:p>
+    <w:p>
+      <w:pPr>
+        <w:pStyle w:val="ListBullet"/>
+        <w:rPr>
+          <w:lang w:val="fr-FR"/>
+        </w:rPr>
+      </w:pPr>
+      <w:r>
+        <w:t>applyMonthlyInterest(accountId, customerId) : intérêt = solde × taux_annuel / 12 — ajouté au solde. Met à jour monthlyGain et totalGain.</w:t>
+      </w:r>
+    </w:p>
+    <w:p>
+      <w:pPr>
+        <w:pStyle w:val="ListBullet"/>
+        <w:rPr>
+          <w:lang w:val="fr-FR"/>
+        </w:rPr>
+      </w:pPr>
+      <w:r>
+        <w:t>getAccount(id) / getAccountsByCustomer(cid) / createAccount(dto) : consultation et création.</w:t>
+      </w:r>
+    </w:p>
+    <w:p>
+      <w:pPr>
+        <w:pStyle w:val="Heading3"/>
+        <w:rPr>
+          <w:lang w:val="fr-FR"/>
+        </w:rPr>
+      </w:pPr>
+      <w:r>
+        <w:t>CheckingAccountService</w:t>
+      </w:r>
+    </w:p>
+    <w:p>
+      <w:pPr>
+        <w:pStyle w:val="Normal"/>
+        <w:rPr>
+          <w:lang w:val="fr-FR"/>
+        </w:rPr>
+      </w:pPr>
+      <w:r>
+        <w:t>Gère les dépôts et retraits sur les comptes chèques (CHECKING). Chaque compte dispose d'un quota de transactions gratuites par mois (monthlyFreeTX, défaut 3) ; au-delà, des frais de txFeePercent % sont appliqués. Chaque opération enregistre automatiquement une transaction.</w:t>
+      </w:r>
+    </w:p>
+    <w:p>
+      <w:pPr>
+        <w:pStyle w:val="ListBullet"/>
+        <w:rPr>
+          <w:lang w:val="fr-FR"/>
+        </w:rPr>
+      </w:pPr>
+      <w:r>
+        <w:t>deposit(accountId, customerId, amount, description) : dépôt — incrémente le compteur mensuel. Si quota dépassé, frais = amount × txFeePercent/100 ; netAmount = amount − frais.</w:t>
+      </w:r>
+    </w:p>
+    <w:p>
+      <w:pPr>
+        <w:pStyle w:val="ListBullet"/>
+        <w:rPr>
+          <w:lang w:val="fr-FR"/>
+        </w:rPr>
+      </w:pPr>
+      <w:r>
+        <w:t>withdraw(accountId, customerId, amount, description) : retrait — vérifie limite journalière et solde suffisant (amount + frais). Si quota dépassé, totalDébité = amount + frais.</w:t>
+      </w:r>
+    </w:p>
+    <w:p>
+      <w:pPr>
+        <w:pStyle w:val="ListBullet"/>
+        <w:rPr>
+          <w:lang w:val="fr-FR"/>
+        </w:rPr>
+      </w:pPr>
+      <w:r>
+        <w:t>getAccount(id) / getAccountsByCustomer(cid) / createAccount(dto) : consultation et création.</w:t>
+      </w:r>
+    </w:p>
+    <w:p>
+      <w:pPr>
+        <w:pStyle w:val="Heading3"/>
+        <w:rPr>
+          <w:lang w:val="fr-FR"/>
+        </w:rPr>
+      </w:pPr>
+      <w:r>
+        <w:t>CreditAccountService</w:t>
+      </w:r>
+    </w:p>
+    <w:p>
+      <w:pPr>
+        <w:pStyle w:val="Normal"/>
+        <w:rPr>
+          <w:lang w:val="fr-FR"/>
+        </w:rPr>
+      </w:pPr>
+      <w:r>
+        <w:t>Gère les achats, paiements et charges mensuelles sur les comptes de crédit (CREDIT). Convention : balance négative = dette (ex. −1450,75 $ = le client doit 1450,75 $). Chaque opération enregistre automatiquement une transaction.</w:t>
+      </w:r>
+    </w:p>
+    <w:p>
+      <w:pPr>
+        <w:pStyle w:val="ListBullet"/>
+        <w:rPr>
+          <w:lang w:val="fr-FR"/>
+        </w:rPr>
+      </w:pPr>
+      <w:r>
+        <w:t>charge(accountId, customerId, amount, description) : achat — rend le solde plus négatif. Vérifie crédit disponible (creditLimit + balance).</w:t>
+      </w:r>
+    </w:p>
+    <w:p>
+      <w:pPr>
+        <w:pStyle w:val="ListBullet"/>
+        <w:rPr>
+          <w:lang w:val="fr-FR"/>
+        </w:rPr>
+      </w:pPr>
+      <w:r>
+        <w:t>makePayment(accountId, customerId, amount) : paiement de dette — rend le solde moins négatif. Vérifie que le montant ne dépasse pas la dette totale.</w:t>
+      </w:r>
+    </w:p>
+    <w:p>
+      <w:pPr>
+        <w:pStyle w:val="ListBullet"/>
+        <w:rPr>
+          <w:lang w:val="fr-FR"/>
+        </w:rPr>
+      </w:pPr>
+      <w:r>
+        <w:t>applyMonthlyCharge(accountId, customerId) : intérêt mensuel = |solde| × taux / 12 + pénalité de 25 % si la date d'échéance est dépassée.</w:t>
+      </w:r>
+    </w:p>
+    <w:p>
+      <w:pPr>
+        <w:pStyle w:val="ListBullet"/>
+        <w:rPr>
+          <w:lang w:val="fr-FR"/>
+        </w:rPr>
+      </w:pPr>
+      <w:r>
+        <w:t>getAccount(id) / getAccountsByCustomer(cid) / createAccount(dto) : consultation et création.</w:t>
+      </w:r>
+    </w:p>
+    <w:p>
+      <w:pPr>
+        <w:pStyle w:val="Heading3"/>
+        <w:rPr>
+          <w:lang w:val="fr-FR"/>
+        </w:rPr>
+      </w:pPr>
+      <w:r>
+        <w:t>CurrencyAccountService</w:t>
+      </w:r>
+    </w:p>
+    <w:p>
+      <w:pPr>
+        <w:pStyle w:val="Normal"/>
+        <w:rPr>
+          <w:lang w:val="fr-FR"/>
+        </w:rPr>
+      </w:pPr>
+      <w:r>
+        <w:t>Gère le gel et le dégel de devises (compte CURRENCY). Le solde CAD est réduit lors du gel et restitué (converti au taux courant) lors du dégel. Chaque opération enregistre automatiquement une transaction.</w:t>
+      </w:r>
+    </w:p>
+    <w:p>
+      <w:pPr>
+        <w:pStyle w:val="ListBullet"/>
+        <w:rPr>
+          <w:lang w:val="fr-FR"/>
+        </w:rPr>
+      </w:pPr>
+      <w:r>
+        <w:t>freeze(accountId, customerId, amountCAD, exchangeRate, months) : convertit amountCAD en USD au taux fourni, réduit le solde CAD, marque le compte comme gelé pour 'months' mois (1–24).</w:t>
+      </w:r>
+    </w:p>
+    <w:p>
+      <w:pPr>
+        <w:pStyle w:val="ListBullet"/>
+        <w:rPr>
+          <w:lang w:val="fr-FR"/>
+        </w:rPr>
+      </w:pPr>
+      <w:r>
+        <w:t>unfreeze(accountId, customerId, exchangeRateNow) : reconvertit le montant USD → CAD au taux actuel. Exige que la date de libération soit atteinte (canWithdrawNow()).</w:t>
+      </w:r>
+    </w:p>
+    <w:p>
+      <w:pPr>
+        <w:pStyle w:val="ListBullet"/>
+        <w:rPr>
+          <w:lang w:val="fr-FR"/>
+        </w:rPr>
+      </w:pPr>
+      <w:r>
+        <w:t>getAccount(id) / getAccountsByCustomer(cid) / createAccount(dto) : consultation et création.</w:t>
+      </w:r>
+    </w:p>
+    <w:p>
+      <w:pPr>
+        <w:pStyle w:val="Heading3"/>
+        <w:rPr>
+          <w:lang w:val="fr-FR"/>
+        </w:rPr>
+      </w:pPr>
+      <w:r>
+        <w:t>LineOfCreditAccountService</w:t>
+      </w:r>
+    </w:p>
+    <w:p>
+      <w:pPr>
+        <w:pStyle w:val="Normal"/>
+        <w:rPr>
+          <w:lang w:val="fr-FR"/>
+        </w:rPr>
+      </w:pPr>
+      <w:r>
+        <w:t>Gère les opérations sur les marges de crédit (LINE_OF_CREDIT). Balance = crédit disponible (toujours positif) ; montant prélevé = creditLimit − balance. Chaque opération enregistre automatiquement une transaction dans la base via TransactionDAO.</w:t>
+      </w:r>
+    </w:p>
+    <w:p>
+      <w:pPr>
+        <w:pStyle w:val="ListBullet"/>
+        <w:rPr>
+          <w:lang w:val="fr-FR"/>
+        </w:rPr>
+      </w:pPr>
+      <w:r>
+        <w:t>drawFromLine(accountId, customerId, amount, description) : prélèvement — réduit le solde disponible. Vérifie statut ACTIVE, crédit suffisant et limite journalière.</w:t>
+      </w:r>
+    </w:p>
+    <w:p>
+      <w:pPr>
+        <w:pStyle w:val="ListBullet"/>
+        <w:rPr>
+          <w:lang w:val="fr-FR"/>
+        </w:rPr>
+      </w:pPr>
+      <w:r>
+        <w:t>makePayment(accountId, customerId, amount) : remboursement — augmente le solde disponible. Vérifie que le montant ne dépasse pas le montant prélevé.</w:t>
+      </w:r>
+    </w:p>
+    <w:p>
+      <w:pPr>
+        <w:pStyle w:val="ListBullet"/>
+        <w:rPr>
+          <w:lang w:val="fr-FR"/>
+        </w:rPr>
+      </w:pPr>
+      <w:r>
+        <w:t>applyMonthlyInterest(accountId, customerId) : intérêt = montant_prélevé × taux_annuel / 12 — débité du solde disponible.</w:t>
+      </w:r>
+    </w:p>
+    <w:p>
+      <w:pPr>
+        <w:pStyle w:val="ListBullet"/>
+        <w:rPr>
+          <w:lang w:val="fr-FR"/>
+        </w:rPr>
+      </w:pPr>
+      <w:r>
+        <w:t>getAccount(id) / getAccountsByCustomer(cid) : consultation de la marge de crédit.</w:t>
+      </w:r>
+    </w:p>
+    <w:p>
+      <w:pPr>
+        <w:pStyle w:val="ListBullet"/>
+        <w:rPr>
+          <w:lang w:val="fr-FR"/>
+        </w:rPr>
+      </w:pPr>
+      <w:r>
+        <w:t>createAccount(dto) : ouverture — balance initiale = creditLimit (aucun prélèvement).</w:t>
+      </w:r>
+    </w:p>
+    <w:p>
+      <w:pPr>
         <w:pStyle w:val="Heading2"/>
         <w:rPr>
           <w:lang w:val="fr-FR"/>
@@ -2392,7 +2876,7 @@
         <w:spacing w:after="40"/>
       </w:pPr>
       <w:r>
-        <w:t>EnumAccountType    : SAVINGS, CHECKING, CREDIT, CURRENCY — types de comptes disponibles.</w:t>
+        <w:t>EnumAccountType    : SAVINGS, CHECKING, CREDIT, LINE_OF_CREDIT, CURRENCY — types de comptes disponibles.</w:t>
       </w:r>
     </w:p>
     <w:p>
@@ -2453,7 +2937,7 @@
         <w:rPr>
           <w:lang w:val="fr-FR"/>
         </w:rPr>
-        <w:t>BankManager est l'interface destinée aux employés de la banque. Elle est accessible après authentification via LoginWindow et affiche le nom du gestionnaire connecté. Elle comporte désormais 4 onglets et un bouton de déconnexion.</w:t>
+        <w:t>BankManager est l'interface destinée aux employés de la banque. Refactorisée selon le patron WindowBuilder, chaque onglet est désormais une classe JPanel autonome (ManagerTabPanel, CustomerTabPanel, AccountTabPanel, LogTabPanel). BankManager n'est plus qu'un assembleur de panneaux avec gestion de session. Elle est accessible après authentification via LoginWindow et affiche le nom du gestionnaire connecté.</w:t>
       </w:r>
     </w:p>
     <w:p>
@@ -2629,7 +3113,7 @@
         <w:rPr>
           <w:lang w:val="fr-FR"/>
         </w:rPr>
-        <w:t>Création de compte : sélection client (JComboBox), type (SAVINGS/CHECKING/CREDIT), solde initial, limite journalière.</w:t>
+        <w:t>Création de compte : sélection client (JComboBox), type (SAVINGS/CHECKING/CREDIT/LINE_OF_CREDIT), solde initial (ou limite de crédit pour LINE_OF_CREDIT), limite journalière. Insertion atomique via LineOfCreditAccountDAO pour les marges de crédit (tables BankAccount + LineOfCredit_Details).</w:t>
       </w:r>
     </w:p>
     <w:p>
@@ -2802,7 +3286,7 @@
         <w:rPr>
           <w:lang w:val="fr-FR"/>
         </w:rPr>
-        <w:t>BankCustomer est l'interface destinée aux clients de la banque. Elle est ouverte après authentification et charge automatiquement les comptes du client depuis Oracle. Toutes les opérations financières sont persistées en temps réel dans la table BankAccount.</w:t>
+        <w:t>BankCustomer est l'interface destinée aux clients de la banque. Refactorisée selon le patron WindowBuilder, chaque onglet est désormais une classe JPanel autonome (TransactionTabPanel, MovementsTabPanel, HistoryTabPanel). BankCustomer n'est plus qu'un assembleur de panneaux. Elle est ouverte après authentification et charge automatiquement les comptes du client depuis Oracle. Toutes les opérations financières sont persistées en temps réel dans la table BankAccount.</w:t>
       </w:r>
     </w:p>
     <w:p>

</xml_diff>